<commit_message>
Fecha de Supernova y ACR: 2026 en los CV y en Trayectoria
Co-Authored-By: Claude Sonnet 5.5 <noreply@anthropic.com>
</commit_message>
<xml_diff>
--- a/public/Dasiel_Torres_CV_English.docx
+++ b/public/Dasiel_Torres_CV_English.docx
@@ -61,7 +61,7 @@
         </w:rPr>
         <w:t xml:space="preserve">Havana, Cuba  |  </w:t>
       </w:r>
-      <w:hyperlink w:history="1" r:id="rIdciehg3tla7vkunixnc_ze">
+      <w:hyperlink w:history="1" r:id="rId7hprwk_uwky2vwymm-lmt">
         <w:r>
           <w:rPr>
             <w:rStyle w:val="Hyperlink"/>
@@ -82,7 +82,7 @@
         </w:rPr>
         <w:t xml:space="preserve">  |  +53 5471 0329  |  </w:t>
       </w:r>
-      <w:hyperlink w:history="1" r:id="rIdpqqyltu2f9uzwqwqvnu5g">
+      <w:hyperlink w:history="1" r:id="rIdqgjwzyju-vx-zmabjcvvz">
         <w:r>
           <w:rPr>
             <w:rStyle w:val="Hyperlink"/>
@@ -103,7 +103,7 @@
         </w:rPr>
         <w:t xml:space="preserve">  |  </w:t>
       </w:r>
-      <w:hyperlink w:history="1" r:id="rIdgjpgi7etwqgw8tkujjntl">
+      <w:hyperlink w:history="1" r:id="rIdgaztvxcjo46a-nf2zz0cu">
         <w:r>
           <w:rPr>
             <w:rStyle w:val="Hyperlink"/>
@@ -405,7 +405,7 @@
           <w:sz w:val="20"/>
           <w:szCs w:val="20"/>
         </w:rPr>
-        <w:t xml:space="preserve">	Most recent role</w:t>
+        <w:t xml:space="preserve">	2026 – Present</w:t>
       </w:r>
     </w:p>
     <w:p>

</xml_diff>

<commit_message>
Rediseño cinematográfico: fichas 3D con física, oro champán y textos profesionales
- Nueva experiencia WebGL (Three.js): ~60 fichas con física y cursor que forman
  cada escena (montón, libro mayor, portal, móvil, tarjeta, transferencia, bolsa,
  órbita), con bloom, intro con contador y modo de movimiento reducido estático.
- Secciones nuevas: hero, manifiesto, proyectos, especialidad, experiencia y
  contacto; páginas de caso con la formación de cada producto.
- Identidad: tema oscuro, acento oro champán, controles de filete, Geist.
- Logo, favicon, iconos y avatar con los colores del sitio.
- Textos EN/ES reescritos en registro profesional; Habaluna como e-commerce
  para Luna S.U.R.L (también corregido en los CV PDF/DOCX).
- Se eliminan gsap y los componentes del diseño anterior.

Co-Authored-By: Claude Opus 5.5 <noreply@anthropic.com>
</commit_message>
<xml_diff>
--- a/public/Dasiel_Torres_CV_English.docx
+++ b/public/Dasiel_Torres_CV_English.docx
@@ -287,7 +287,7 @@
           <w:sz w:val="21"/>
           <w:szCs w:val="21"/>
         </w:rPr>
-        <w:t xml:space="preserve">	PostgreSQL, Prisma ORM, relational schema design, transactional and concurrency-safe data access</w:t>
+        <w:t xml:space="preserve">	PostgreSQL, Prisma ORM, Redis, relational schema design, transactional and concurrency-safe data access</w:t>
       </w:r>
     </w:p>
     <w:p>
@@ -561,7 +561,7 @@
           <w:sz w:val="20"/>
           <w:szCs w:val="20"/>
         </w:rPr>
-        <w:t xml:space="preserve">Tourism booking platform for the Cuban market  ·  Next.js, PostgreSQL, Prisma, Strapi, Vercel</w:t>
+        <w:t xml:space="preserve">E-commerce for Luna S.U.R.L (assorted products)  ·  Next.js, PostgreSQL, Prisma, Redis, Vercel</w:t>
       </w:r>
     </w:p>
     <w:p>
@@ -582,7 +582,7 @@
           <w:sz w:val="21"/>
           <w:szCs w:val="21"/>
         </w:rPr>
-        <w:t xml:space="preserve">Owned the product end to end (product decisions, architecture, UX/UI, backend and infrastructure) for a booking platform serving Cuba's tourism sector.</w:t>
+        <w:t xml:space="preserve">Owned the product end to end (product decisions, architecture, UX/UI, backend and infrastructure) for an online store selling a varied catalogue of products for Luna S.U.R.L.</w:t>
       </w:r>
     </w:p>
     <w:p>
@@ -603,7 +603,7 @@
           <w:sz w:val="21"/>
           <w:szCs w:val="21"/>
         </w:rPr>
-        <w:t xml:space="preserve">Designed a Next.js App Router architecture (React Server Components with Client Components) backed by PostgreSQL via Prisma, using Strapi as a headless CMS to separate transactional booking logic from operator-managed content.</w:t>
+        <w:t xml:space="preserve">Built the store on a Next.js App Router architecture backed by PostgreSQL via Prisma and Redis: product catalogue, cart and checkout.</w:t>
       </w:r>
     </w:p>
     <w:p>
@@ -624,7 +624,7 @@
           <w:sz w:val="21"/>
           <w:szCs w:val="21"/>
         </w:rPr>
-        <w:t xml:space="preserve">Built a real-time availability engine with atomic conflict detection that prevents double bookings under concurrent requests without slowing responses.</w:t>
+        <w:t xml:space="preserve">Integrated online payments through the Supernova payment gateway and built inventory and order management.</w:t>
       </w:r>
     </w:p>
     <w:p>
@@ -645,7 +645,7 @@
           <w:sz w:val="21"/>
           <w:szCs w:val="21"/>
         </w:rPr>
-        <w:t xml:space="preserve">Delivered mobile-first booking and payment flows and a back office for operators to manage listings, availability and pricing without engineering support; managed Vercel deployment, database provisioning and monitoring.</w:t>
+        <w:t xml:space="preserve">Delivered an admin panel for the client to manage products, prices, stock and orders without engineering support; managed Vercel deployment and database provisioning.</w:t>
       </w:r>
     </w:p>
     <w:p>

</xml_diff>